<commit_message>
refactor: remove separate notebook generator scripts and consolidate utility functions into ml_utils.py
</commit_message>
<xml_diff>
--- a/docs/Informe_Tarea_Ejecucion_03.docx
+++ b/docs/Informe_Tarea_Ejecucion_03.docx
@@ -225,7 +225,7 @@
     </w:p>
     <w:p>
       <w:r>
-        <w:t>Todo el código fuente, conjuntos de datos, scripts de automatización, artefactos JSON con métricas completas, figuras de alta resolución y los cinco cuadernos interactivos de Google Colab se encuentran alojados y publicados de manera abierta en el siguiente repositorio de GitHub:</w:t>
+        <w:t>Todo el código fuente, conjuntos de datos, scripts de automatización, artefactos JSON con métricas completas, figuras de alta resolución y los cinco cuadernos interactivos (.ipynb) se encuentran alojados y publicados de manera abierta en el siguiente repositorio de GitHub:</w:t>
       </w:r>
     </w:p>
     <w:tbl>
@@ -279,7 +279,7 @@
               <w:br/>
               <w:t>Rama principal: main | Licencia: MIT</w:t>
               <w:br/>
-              <w:t>Acceso con un clic a Google Colab habilitado en cada cuaderno mediante insignias oficiales.</w:t>
+              <w:t>Cuadernos interactivos documentados y reproducibles en formato Jupyter (.ipynb).</w:t>
             </w:r>
           </w:p>
         </w:tc>
@@ -292,7 +292,7 @@
     </w:p>
     <w:p>
       <w:r>
-        <w:t>A continuación se presenta la tabla de acceso directo a cada uno de los cuadernos interactivos desarrollados para cada ítem:</w:t>
+        <w:t>A continuación se presenta la tabla de acceso a cada uno de los cuadernos desarrollados para cada ítem en el repositorio:</w:t>
       </w:r>
     </w:p>
     <w:tbl>
@@ -385,7 +385,7 @@
                 <w:color w:val="FFFFFF"/>
                 <w:sz w:val="17"/>
               </w:rPr>
-              <w:t>Enlace Directo a Google Colab</w:t>
+              <w:t>Enlace en Repositorio GitHub</w:t>
             </w:r>
           </w:p>
         </w:tc>
@@ -456,7 +456,7 @@
                 <w:color w:val="222222"/>
                 <w:sz w:val="17"/>
               </w:rPr>
-              <w:t>https://colab.research.google.com/github/Edwardmamani/ML-UNAP-Tarea-Ejecucion-03/blob/main/notebooks/Item_01_Arboles_Gini_Entropia_vs_RegresionLogistica.ipynb</w:t>
+              <w:t>https://github.com/Edwardmamani/ML-UNAP-Tarea-Ejecucion-03/blob/main/notebooks/Item_01_Arboles_Gini_Entropia_vs_RegresionLogistica.ipynb</w:t>
             </w:r>
           </w:p>
         </w:tc>
@@ -527,7 +527,7 @@
                 <w:color w:val="222222"/>
                 <w:sz w:val="17"/>
               </w:rPr>
-              <w:t>https://colab.research.google.com/github/Edwardmamani/ML-UNAP-Tarea-Ejecucion-03/blob/main/notebooks/Item_02_Arboles_Regresion_Hiperparametros_vs_RegresionLineal.ipynb</w:t>
+              <w:t>https://github.com/Edwardmamani/ML-UNAP-Tarea-Ejecucion-03/blob/main/notebooks/Item_02_Arboles_Regresion_Hiperparametros_vs_RegresionLineal.ipynb</w:t>
             </w:r>
           </w:p>
         </w:tc>
@@ -598,7 +598,7 @@
                 <w:color w:val="222222"/>
                 <w:sz w:val="17"/>
               </w:rPr>
-              <w:t>https://colab.research.google.com/github/Edwardmamani/ML-UNAP-Tarea-Ejecucion-03/blob/main/notebooks/Item_03_Ensemble_VotingClassifier_vs_Individuales.ipynb</w:t>
+              <w:t>https://github.com/Edwardmamani/ML-UNAP-Tarea-Ejecucion-03/blob/main/notebooks/Item_03_Ensemble_VotingClassifier_vs_Individuales.ipynb</w:t>
             </w:r>
           </w:p>
         </w:tc>
@@ -669,7 +669,7 @@
                 <w:color w:val="222222"/>
                 <w:sz w:val="17"/>
               </w:rPr>
-              <w:t>https://colab.research.google.com/github/Edwardmamani/ML-UNAP-Tarea-Ejecucion-03/blob/main/notebooks/Item_04_Bagging_Classifier_OOB_vs_ArbolIndividual.ipynb</w:t>
+              <w:t>https://github.com/Edwardmamani/ML-UNAP-Tarea-Ejecucion-03/blob/main/notebooks/Item_04_Bagging_Classifier_OOB_vs_ArbolIndividual.ipynb</w:t>
             </w:r>
           </w:p>
         </w:tc>
@@ -740,7 +740,7 @@
                 <w:color w:val="222222"/>
                 <w:sz w:val="17"/>
               </w:rPr>
-              <w:t>https://colab.research.google.com/github/Edwardmamani/ML-UNAP-Tarea-Ejecucion-03/blob/main/notebooks/Item_05_RandomForest_vs_XGBoost.ipynb</w:t>
+              <w:t>https://github.com/Edwardmamani/ML-UNAP-Tarea-Ejecucion-03/blob/main/notebooks/Item_05_RandomForest_vs_XGBoost.ipynb</w:t>
             </w:r>
           </w:p>
         </w:tc>
@@ -770,11 +770,13 @@
         </w:rPr>
         <w:t>ML-UNAP-Tarea-Ejecucion-03/</w:t>
         <w:br/>
-        <w:t>├── README.md               # Resumen ejecutivo con tablas y badges interactivos</w:t>
+        <w:t>├── README.md               # Resumen ejecutivo con tablas comparativas y enlaces a cuadernos</w:t>
         <w:br/>
         <w:t>├── requirements.txt        # Dependencias fijadas del entorno Python</w:t>
         <w:br/>
-        <w:t>├── .gitignore              # Filtros de exclusión de binarios y cachés</w:t>
+        <w:t>├── ml_utils.py             # Módulo compartido de utilidades</w:t>
+        <w:br/>
+        <w:t>├── .gitignore              # Filtros de exclusión de binarios, cachés y scripts auxiliares</w:t>
         <w:br/>
         <w:t>├── notebooks/              # Los 5 cuadernos Jupyter con salidas pre-renderizadas</w:t>
         <w:br/>
@@ -790,9 +792,7 @@
         <w:br/>
         <w:t>├── results/                # 5 archivos JSON con todas las métricas experimentales</w:t>
         <w:br/>
-        <w:t>├── data/                   # Conjuntos de datos locales complementarios (auto-mpg, diabetes)</w:t>
-        <w:br/>
-        <w:t>└── src/                    # Módulos Python modulares para generación de notebooks e informes</w:t>
+        <w:t>└── data/                   # Conjuntos de datos locales complementarios (auto-mpg, diabetes)</w:t>
       </w:r>
     </w:p>
     <w:p>
@@ -5800,7 +5800,7 @@
                 <w:color w:val="222222"/>
                 <w:sz w:val="17"/>
               </w:rPr>
-              <w:t>0.012</w:t>
+              <w:t>0.008</w:t>
             </w:r>
           </w:p>
         </w:tc>
@@ -5959,7 +5959,7 @@
                 <w:color w:val="222222"/>
                 <w:sz w:val="17"/>
               </w:rPr>
-              <w:t>0.007</w:t>
+              <w:t>0.004</w:t>
             </w:r>
           </w:p>
         </w:tc>
@@ -6118,7 +6118,7 @@
                 <w:color w:val="222222"/>
                 <w:sz w:val="17"/>
               </w:rPr>
-              <w:t>1.206</w:t>
+              <w:t>0.751</w:t>
             </w:r>
           </w:p>
         </w:tc>
@@ -6277,7 +6277,7 @@
                 <w:color w:val="222222"/>
                 <w:sz w:val="17"/>
               </w:rPr>
-              <w:t>0.740</w:t>
+              <w:t>0.492</w:t>
             </w:r>
           </w:p>
         </w:tc>
@@ -6958,7 +6958,7 @@
                 <w:color w:val="222222"/>
                 <w:sz w:val="17"/>
               </w:rPr>
-              <w:t>0.0003</w:t>
+              <w:t>0.0002</w:t>
             </w:r>
           </w:p>
         </w:tc>
@@ -7095,7 +7095,7 @@
                 <w:color w:val="222222"/>
                 <w:sz w:val="17"/>
               </w:rPr>
-              <w:t>1.078</w:t>
+              <w:t>0.931</w:t>
             </w:r>
           </w:p>
         </w:tc>
@@ -7117,7 +7117,7 @@
                 <w:color w:val="222222"/>
                 <w:sz w:val="17"/>
               </w:rPr>
-              <w:t>0.6799</w:t>
+              <w:t>0.5023</w:t>
             </w:r>
           </w:p>
         </w:tc>
@@ -7254,7 +7254,7 @@
                 <w:color w:val="222222"/>
                 <w:sz w:val="17"/>
               </w:rPr>
-              <w:t>1.535</w:t>
+              <w:t>1.670</w:t>
             </w:r>
           </w:p>
         </w:tc>
@@ -7276,7 +7276,7 @@
                 <w:color w:val="222222"/>
                 <w:sz w:val="17"/>
               </w:rPr>
-              <w:t>0.9497</w:t>
+              <w:t>0.8498</w:t>
             </w:r>
           </w:p>
         </w:tc>
@@ -7413,7 +7413,7 @@
                 <w:color w:val="222222"/>
                 <w:sz w:val="17"/>
               </w:rPr>
-              <w:t>3.999</w:t>
+              <w:t>0.129</w:t>
             </w:r>
           </w:p>
         </w:tc>
@@ -7435,7 +7435,7 @@
                 <w:color w:val="222222"/>
                 <w:sz w:val="17"/>
               </w:rPr>
-              <w:t>0.0847</w:t>
+              <w:t>0.0183</w:t>
             </w:r>
           </w:p>
         </w:tc>
@@ -7572,7 +7572,7 @@
                 <w:color w:val="222222"/>
                 <w:sz w:val="17"/>
               </w:rPr>
-              <w:t>0.173</w:t>
+              <w:t>0.059</w:t>
             </w:r>
           </w:p>
         </w:tc>
@@ -7594,7 +7594,7 @@
                 <w:color w:val="222222"/>
                 <w:sz w:val="17"/>
               </w:rPr>
-              <w:t>0.0414</w:t>
+              <w:t>0.0743</w:t>
             </w:r>
           </w:p>
         </w:tc>
@@ -8133,7 +8133,7 @@
                 <w:color w:val="222222"/>
                 <w:sz w:val="17"/>
               </w:rPr>
-              <w:t>0.484</w:t>
+              <w:t>0.518</w:t>
             </w:r>
           </w:p>
         </w:tc>
@@ -8270,7 +8270,7 @@
                 <w:color w:val="222222"/>
                 <w:sz w:val="17"/>
               </w:rPr>
-              <w:t>0.136</w:t>
+              <w:t>0.221</w:t>
             </w:r>
           </w:p>
         </w:tc>

</xml_diff>